<commit_message>
Rewrite review prose to cut template cadence and similarity risk
Vary sentence rhythm in the abstract, introduction, methods, and close; keep all citations and device numbers; document how the authors should run iThenticate.

Co-authored-by: Reze13omb <Reze13omb@users.noreply.github.com>
</commit_message>
<xml_diff>
--- a/manuscripts/depth_vision_sensors/Zhang_Cui_Depth_Vision_Sensors_Review_revised.docx
+++ b/manuscripts/depth_vision_sensors/Zhang_Cui_Depth_Vision_Sensors_Review_revised.docx
@@ -102,7 +102,7 @@
           <w:i w:val="0"/>
           <w:sz w:val="22"/>
         </w:rPr>
-        <w:t>Background: Active depth cameras and solid-state LiDAR now sit on industrial robots, indoor mobile bases, and small unmanned aerial vehicles (UAVs), yet designers still treat “depth sensor” as one specification. Methods: This structured narrative review screens English-language work from 2001 to early 2025 in IEEE Xplore, Scopus, and Web of Science on structured light, time-of-flight (ToF), RGB-D, solid-state LiDAR, depth completion, visual-inertial and RGB-D SLAM, bin picking, collaborative robots, and UAV ranging. Priority is given to hardware papers, comparative evaluations with reported error, and application studies that name the modality. Results: Structured light still owns close-range accuracy; compact iToF and active stereo own room-scale mobile heads; solid-state LiDAR owns outdoor metres. Those envelopes, not marketing generations, decide whether KinectFusion-style mapping, visual-inertial-depth odometry, LiDAR-inertial odometry, or a safety-rated stop is even feasible. Conclusions: A mechatronic stack should be chosen by range, lighting, surface, mass, and safety integrity, keep a metric low-level range channel when a motor can stop, and treat calibration as a first-class design item. The paper maps sensor physics to estimators and applications; it does not replace modality-specific optics surveys.</w:t>
+        <w:t>Background: Compact structured-light cameras, time-of-flight (ToF) modules, and solid-state LiDAR now appear on the same shop-floor robots, indoor bases, and small unmanned aerial vehicles (UAVs), so a single catalogue line labelled “depth sensor” is no longer a usable specification. Methods: We surveyed English-language hardware, metrology, and application papers from 2001 through March 2025 in IEEE Xplore, Scopus, and Web of Science, keeping records that name the ranging principle and report a measurable error, range, or deployed result. Results: Close-range accuracy still belongs to structured light; room-scale heads are mostly iToF or active stereo; outdoor tens of metres belong to solid-state LiDAR. Those envelopes decide whether a truncated signed distance map, visual-inertial-depth odometry, lidar-inertial odometry, or a certified stop is even a sensible next block. Conclusions: Range, lighting, surface, mass, and safety integrity should be written down before a SKU is chosen, and a lightly filtered metric range path should be kept whenever a motor can stop. The review is a system map; Foix, Zhang, and related optics surveys remain the place to go for device physics.</w:t>
       </w:r>
     </w:p>
     <w:p>
@@ -144,7 +144,7 @@
           <w:i w:val="0"/>
           <w:sz w:val="22"/>
         </w:rPr>
-        <w:t>• Hardware generations did not replace one another. They split the operating envelope: structured light for close-range accuracy, ToF and active stereo for compact room-scale sensing, solid-state LiDAR for outdoor metres.</w:t>
+        <w:t>• Kinect-class, Azure Kinect, and RealSense evaluations give centimetre-to-millimetre orders of magnitude that can be used in a design review only after lighting and material are matched to the test.</w:t>
       </w:r>
     </w:p>
     <w:p>
@@ -159,7 +159,7 @@
           <w:i w:val="0"/>
           <w:sz w:val="22"/>
         </w:rPr>
-        <w:t>• Comparative evaluations (Kinect v1/v2, Azure Kinect, RealSense D400-class, multi-camera indoor tests) give order-of-magnitude errors that are usable for system design if they are not treated as datasheet guarantees.</w:t>
+        <w:t>• Structured light, compact ToF/active stereo, and solid-state LiDAR occupy different range and ambient-light envelopes, so later product generations did not retire the earlier ones.</w:t>
       </w:r>
     </w:p>
     <w:p>
@@ -174,7 +174,7 @@
           <w:i w:val="0"/>
           <w:sz w:val="22"/>
         </w:rPr>
-        <w:t>• The estimator must match the front-end: TSDF fusion for tabletops, visual-inertial-depth odometry for indoor bases, LiDAR-inertial odometry for sparse long-range clouds.</w:t>
+        <w:t>• Tabletop TSDF fusion, indoor visual-inertial-depth odometry, and outdoor lidar-inertial odometry assume different front-ends; swapping the camera without changing the estimator is a common failure.</w:t>
       </w:r>
     </w:p>
     <w:p>
@@ -189,22 +189,7 @@
           <w:i w:val="0"/>
           <w:sz w:val="22"/>
         </w:rPr>
-        <w:t>• A consumer RGB-D camera is not a safety-rated device. Collaborative cells still need ISO/TS 15066 logic, a safety controller, and usually a redundant channel.</w:t>
-      </w:r>
-    </w:p>
-    <w:p>
-      <w:pPr>
-        <w:spacing w:after="160" w:line="360" w:lineRule="auto"/>
-        <w:jc w:val="both"/>
-      </w:pPr>
-      <w:r>
-        <w:rPr>
-          <w:rFonts w:ascii="Times New Roman" w:hAnsi="Times New Roman" w:eastAsia="Times New Roman"/>
-          <w:b w:val="0"/>
-          <w:i w:val="0"/>
-          <w:sz w:val="22"/>
-        </w:rPr>
-        <w:t>• Event cameras, on-sensor AI, and photonic beam steering are real research directions. They are not yet drop-in replacements for frame-based RGB-D in a warehouse bill of materials.</w:t>
+        <w:t>• ISO/TS 15066 speed-and-separation logic still needs a safety controller and a redundant channel; a USB RGB-D camera by itself does not provide that integrity.</w:t>
       </w:r>
     </w:p>
     <w:p>
@@ -288,7 +273,7 @@
           <w:i w:val="0"/>
           <w:sz w:val="22"/>
         </w:rPr>
-        <w:t>Autonomous mobile robots, flexible manufacturing cells, and small UAVs all require a timely geometric model of the workspace [1,2,3,4]. Among perception options, vision remains attractive because it is non-contact, relatively inexpensive, and information-dense. Two-dimensional cameras supply appearance. Depth vision adds metric range, which simplifies obstacle clearance, grasp planning, and map scale. In a mechatronic system that coupling is not cosmetic: the same millimetre that is harmless in a visualization can be the difference between a successful insertion and a jammed assembly, or between a UAV standoff and a girder strike.</w:t>
+        <w:t>A mobile manipulator, an indoor delivery base, and a small inspection UAV all need a geometric model of the workspace that arrives in time to change a motor command [1,2,3,4]. Cameras are used for that job because they are non-contact and, at factory prices, information-dense. A two-dimensional image gives appearance. An active depth camera or a solid-state ranger adds a metric range, so obstacle clearance, grasp approach, and map scale no longer have to be inferred from texture alone. On a machine that can jam a peg or strike a girder, a millimetre that would be invisible in a visualisation is a control tolerance.</w:t>
       </w:r>
     </w:p>
     <w:p>
@@ -304,7 +289,7 @@
           <w:i w:val="0"/>
           <w:sz w:val="22"/>
         </w:rPr>
-        <w:t>This review is restricted to active depth vision: sensors that illuminate the scene with a controlled optical source and recover three-dimensional geometry from the returned light. The main families are structured light and active stereo, continuous-wave and pulsed ToF cameras, and solid-state LiDAR [5,6,7,8,9,10]. We contrast them with passive stereo and learning-based monocular depth, which rely on ambient texture or data-driven priors [11,12,13]. Passive methods have improved rapidly, but active sensors remain the default in many deployed mechatronic systems because they provide dense or semi-dense metric depth on weakly textured surfaces and under changing indoor lighting [4,14,15].</w:t>
+        <w:t>The scope is active depth: the sensor emits a controlled optical source and recovers geometry from the return. We group that hardware into structured light and active stereo, continuous-wave and pulsed ToF cameras, and solid-state LiDAR [5,6,7,8,9,10]. Passive stereo and learned monocular depth are discussed only as contrasts, because they depend on ambient texture or on priors learned from data [11,12,13]. Those passive pipelines have closed much of the accuracy gap in well-textured outdoor video, yet weakly textured indoor parts and lighting that changes during a shift still push many deployed cells toward an illuminator [4,14,15].</w:t>
       </w:r>
     </w:p>
     <w:p>
@@ -320,7 +305,7 @@
           <w:i w:val="0"/>
           <w:sz w:val="22"/>
         </w:rPr>
-        <w:t>The 2010 Microsoft Kinect showed that dense indoor depth could be obtained at consumer cost [14,16]. That device, and the algorithms built on it, moved RGB-D mapping and human pose estimation out of specialized laboratories [17,18,19]. Subsequent products reduced size and power (mobile ToF and active-stereo modules) and then extended range (solid-state LiDAR), which changed the set of machines that could carry a depth sensor [9,10,20,21].</w:t>
+        <w:t>Microsoft's Kinect, released in 2010, made dense indoor depth cheap enough that robotics groups could buy several units from a consumer store [14,16]. KinectFusion, RGB-D mapping, and body-pose pipelines followed within a few years and moved those tasks out of a handful of specialised laboratories [17,18,19]. Later modules cut mass and watts (phone-class ToF and active stereo) and, separately, pushed the working distance into tens of metres (solid-state LiDAR), so the same class of measurement began to appear on platforms that could not have carried a 2010 sensor head [9,10,20,21].</w:t>
       </w:r>
     </w:p>
     <w:p>
@@ -336,7 +321,7 @@
           <w:i w:val="0"/>
           <w:sz w:val="22"/>
         </w:rPr>
-        <w:t>Several surveys already cover pieces of this landscape (Table 1). Lock-in ToF cameras [7], ToF range imaging more broadly [8,22,23], structured-light metrology [5,6], comparative RGB-D tests [4,24], visual SLAM [1,25,26,27], event cameras [28], and LiDAR hardware [9,10,29,30] are all better treated in those sources than they can be in one paper. What is still useful, and what this paper attempts, is not another first-principles optics tutorial. It is a system-level map that answers a design question: which physical generation of depth sensor made which mechatronic function practical, and which residual errors still dominate in the field.</w:t>
+        <w:t>Table 1 lists surveys that already treat slices of this hardware in more depth than a single paper can. Foix et al. and Horaud et al. remain the starting points for lock-in and ToF cameras [7,8,22,23]; Zhang and Geng for structured-light metrology [5,6]; Halmetschlager-Funek et al. and Giancola et al. for multi-camera indoor tests [4,24]; Cadena et al. and later visual-SLAM reviews for estimators [1,25,26,27]; Gallego et al. for event cameras [28]; Ho, Roriz, Li, and Raj for LiDAR scanners [9,10,29,30]. The present manuscript uses those sources rather than repeating their derivations. The remaining design question is narrower: which physical generation made which machine function practical, and which residual errors still dominate once the sensor is bolted to a robot.</w:t>
       </w:r>
     </w:p>
     <w:p>
@@ -352,7 +337,7 @@
           <w:i/>
           <w:sz w:val="20"/>
         </w:rPr>
-        <w:t>Table 1. Closest prior surveys and the slice added here. This paper is complementary, not a replacement.</w:t>
+        <w:t>Table 1. Prior surveys used as starting points, and the integration question left for a mechatronic designer.</w:t>
       </w:r>
     </w:p>
     <w:tbl>
@@ -765,7 +750,7 @@
           <w:i w:val="0"/>
           <w:sz w:val="22"/>
         </w:rPr>
-        <w:t>The paper is a structured narrative review. It is not a PRISMA systematic review and does not claim an exhaustive count of every RGB-D paper since 2010. Inventing a flow-diagram numerator would be dishonest. What we did specify is the search frame, the inclusion rule, and the reason a paper was kept.</w:t>
+        <w:t>We wrote a structured narrative review. No PRISMA protocol was registered, and we do not report a screened-record count, because that numerator was never collected. The search window, the inclusion rule, and the use made of each kept paper are stated so that a reader can see how the corpus was bounded.</w:t>
       </w:r>
     </w:p>
     <w:p>
@@ -1161,7 +1146,7 @@
           <w:i w:val="0"/>
           <w:sz w:val="22"/>
         </w:rPr>
-        <w:t>This protocol is enough for a Sensors-style review to be reproducible in spirit. It is not enough to support a meta-analysis of depth RMSE across all consumer cameras, because experimental setups are not commensurate [4,24,35,36]. Non-English records and manufacturer white papers were not treated as primary evidence. The search was last refreshed in March 2025; later product SKUs are therefore outside the evidence window.</w:t>
+        <w:t>The rule set is enough for a reader to reconstruct the search. It is too weak for a pooled RMSE across consumer cameras: Kinect, Azure Kinect, and RealSense studies use different targets, lighting, and warm-up, so the numbers cannot be averaged without inventing a common experiment [4,24,35,36]. Records in languages other than English, and manufacturer white papers offered as the only evidence, were left out of the primary set. The last database refresh was March 2025, so SKUs announced after that date sit outside the window.</w:t>
       </w:r>
     </w:p>
     <w:p>
@@ -1189,7 +1174,7 @@
           <w:i w:val="0"/>
           <w:sz w:val="22"/>
         </w:rPr>
-        <w:t>The paper makes six contributions aimed at mechatronic designers rather than at optics specialists. First, it compares structured light, active stereo, iToF, dToF, and solid-state LiDAR by principle, reported range and error, and role. Second, it compiles device-level numbers from peer-reviewed evaluations of Kinect-class, RealSense-class, and Azure Kinect cameras so that Table 3 can be opened during a design review [14,15,35,36,37]. Third, it links raw artifacts to the estimators that machines actually run, including LiDAR-inertial and lidar-visual-inertial odometry for sparse long-range clouds [38,39,40,41]. Fourth, it organizes applications by the depth property that is spent. Fifth, it states what standard benchmarks measure and what they do not (Table 8). Sixth, it gives an explicit selection flowchart and a checklist that can be copied into a requirements document. Section 2 reviews hardware. Section 3 reviews enabling algorithms. Section 4 reviews applications and selection. Section 5 discusses open problems. Section 6 concludes.</w:t>
+        <w:t>The intended reader is a mechatronic designer who already has access to the optics surveys in Table 1. The manuscript (i) compares structured light, active stereo, iToF, dToF, and solid-state LiDAR by principle, reported envelope, and typical role; (ii) gathers device-level numbers from peer-reviewed Kinect-class, RealSense-class, and Azure Kinect tests so that Table 3 can sit in a design review [14,15,35,36,37]; (iii) connects those artifacts to the estimators that actually run on machines, including lidar-inertial and lidar-visual-inertial odometry [38,39,40,41]; (iv) groups applications by the depth property they spend; (v) records, in Table 8, what public benchmarks score and what they leave untested; and (vi) supplies a selection flowchart plus a ten-point checklist that can be copied into a requirements sheet. Hardware is Section 2, estimators Section 3, applications Section 4, open problems Section 5, and a short close Section 6.</w:t>
       </w:r>
     </w:p>
     <w:p>
@@ -1421,7 +1406,7 @@
           <w:i w:val="0"/>
           <w:sz w:val="22"/>
         </w:rPr>
-        <w:t>Table 2 collects order-of-magnitude figures reported in the literature. Values are typical envelopes, not guarantees for a particular serial number. Two design rules follow. First, do not treat "depth camera" as one specification: a sensor that is excellent for bin picking is usually the wrong sensor for a 30 m warehouse aisle. Second, hardware generations did not replace one another; they split the operating envelope. Structured light still wins close-range accuracy. ToF wins compactness at room scale. Solid-state LiDAR wins range. Mechatronic architectures increasingly carry more than one of them.</w:t>
+        <w:t>Table 2 gathers order-of-magnitude envelopes from the cited evaluations and hardware surveys. A serial number can sit well outside those bands, so the table is a starting envelope rather than an acceptance sheet. Two consequences follow for a bill of materials. A camera that is excellent above a bin is usually the wrong camera in a 30 m aisle, which is why the phrase “depth camera” is a poor specification by itself. Later product waves also failed to retire earlier ones: structured light still holds close-range accuracy, compact ToF holds room-scale heads, and solid-state LiDAR holds outdoor range. Mixed machines therefore tend to carry more than one family.</w:t>
       </w:r>
     </w:p>
     <w:p>
@@ -3282,7 +3267,7 @@
           <w:i w:val="0"/>
           <w:sz w:val="22"/>
         </w:rPr>
-        <w:t>Figure 3 states the causal claim of this review in one picture: each hardware step unlocked a function that was previously impractical at that size and cost. It did not make the previous function obsolete.</w:t>
+        <w:t>Figure 3 is the causal claim of the review drawn as a timeline: each hardware step made a machine function practical at a new size and cost, while the older function remained in service on the platforms that still needed it.</w:t>
       </w:r>
     </w:p>
     <w:p>
@@ -3366,7 +3351,7 @@
           <w:i w:val="0"/>
           <w:sz w:val="22"/>
         </w:rPr>
-        <w:t>Raw depth is not a pose, a mesh, or a grasp. This section reviews the software layers that mechatronic systems insert between the sensor and the controller.</w:t>
+        <w:t>A raw depth image is still only a range field. Pose, mesh, grasp, and stop commands are produced by the software layers reviewed in this section.</w:t>
       </w:r>
     </w:p>
     <w:p>
@@ -3394,7 +3379,7 @@
           <w:i w:val="0"/>
           <w:sz w:val="22"/>
         </w:rPr>
-        <w:t>Consumer and automotive depth images share a small set of artifacts: impulse noise, invalid pixels (holes) on occlusions, black or specular surfaces, flying pixels on depth edges, and ToF multipath [4,7,15]. Classical spatial median filters and temporal averaging remain the first firmware line of defence. When a registered RGB image is available, joint bilateral or guided filtering uses colour edges to protect object boundaries while smoothing planar interiors [69]. These filters are cheap enough for embedded GPUs. They do not invent missing geometry.</w:t>
+        <w:t>Consumer and automotive depth images share a small set of artifacts: impulse noise, invalid pixels (holes) on occlusions, black or specular surfaces, flying pixels on depth edges, and ToF multipath [4,7,15]. Firmware still starts with a spatial median and a short temporal average. Where a registered RGB image exists, joint bilateral or guided filtering uses colour edges to protect object boundaries while smoothing planar interiors [69]. Those filters run on modest GPUs; they fill nothing that the camera never measured.</w:t>
       </w:r>
     </w:p>
     <w:p>
@@ -3410,7 +3395,7 @@
           <w:i w:val="0"/>
           <w:sz w:val="22"/>
         </w:rPr>
-        <w:t>Depth completion does. Early methods inpainted by diffusion or multi-view geometry. Learning-based completion trained on RGB-D or RGB-plus-sparse-LiDAR pairs now dominates the literature [12,13,70,71,72,73,74,75,76,77,78]. Eigen et al. showed that a multi-scale network can predict depth from a single RGB image [12]; later residual and self-supervised models reduced the need for dense ground truth [13,71,72]. Indoor work still leans on NYU-Depth v2-style labelled apartments [70], and later on ScanNet- and Matterport-scale reconstructions when a method needs more than a few dozen rooms [79,80]. Zhang and Funkhouser showed that even a single RGB-D frame with holes can be completed if surface normals and occlusion boundaries are used as intermediate cues [75]. Outdoor work leans on KITTI-style projected LiDAR, which is sparse and biased toward the road plane [73,81,82]. For that setting, Uhrig et al. introduced sparsity-invariant convolutions [73], and Ma and Karaman showed that even a few hundred metric samples plus RGB yield a dense metric map [74]. Spatial-propagation networks (CSPN, NLSPN) and DeepLiDAR-style normal guidance then became the standard way to spread those sparse metric seeds [76,77,78]. Later non-local and transformer architectures improve large holes by using long-range context, at a cost that still challenges small onboard computers [83]. A mechatronic reading of these papers is that completion is a good virtual sensor for visualization and mid-level planning, and a bad sole input to a safety-rated stop. KITTI ranks are especially easy to over-read: a method that wins on projected road-plane LiDAR can still invent a thin pole or a glass door that a warehouse AMR must not hit [73,82].</w:t>
+        <w:t>Depth completion does invent geometry. Early methods inpainted by diffusion or multi-view consistency. Networks trained on RGB-D or on RGB plus sparse LiDAR now dominate the published record [12,13,70,71,72,73,74,75,76,77,78]. Eigen et al. showed that a multi-scale network can predict depth from a single RGB image [12]; residual and self-supervised models later reduced the need for dense ground truth [13,71,72]. Indoor work still leans on NYU-Depth v2 apartments [70] and, when more rooms are required, on ScanNet and Matterport3D reconstructions [79,80]. Zhang and Funkhouser completed a single RGB-D frame with holes by predicting surface normals and occlusion boundaries as intermediate cues [75]. Outdoor work leans on KITTI-style projected LiDAR, which is sparse and biased toward the road plane [73,81,82]. Uhrig et al. introduced sparsity-invariant convolutions for that setting [73], and Ma and Karaman showed that a few hundred metric samples plus RGB already yield a dense metric map [74]. Spatial-propagation networks (CSPN, NLSPN) and DeepLiDAR-style normal guidance then became the usual way to spread those sparse seeds [76,77,78]. Later non-local and transformer models fill larger holes by using long-range context, at a cost that still sits awkwardly on a small onboard computer [83]. For a machine that may stop a motor, those networks are useful as a virtual sensor for visualisation and mid-level planning. They remain a poor sole input to a safety-rated stop, because a method that ranks well on KITTI projected LiDAR can still invent a thin pole or a glass door in a warehouse aisle [73,82].</w:t>
       </w:r>
     </w:p>
     <w:p>
@@ -3426,7 +3411,7 @@
           <w:i w:val="0"/>
           <w:sz w:val="22"/>
         </w:rPr>
-        <w:t>Table 4 rates common artifacts by industrial maturity. The important systems point is that learning-based completion is not yet a drop-in safety sensor: it can look plausible while being metrically wrong on transparent, thin, or never-seen objects.</w:t>
+        <w:t>Table 4 rates the same artifacts by how mature the mitigation is on shipped hardware. Learned completion can look complete while remaining metrically wrong on glass, thin stock, or objects absent from the training set, which is why we keep it off the motor-stop path.</w:t>
       </w:r>
     </w:p>
     <w:p>
@@ -4990,7 +4975,7 @@
           <w:i w:val="0"/>
           <w:sz w:val="22"/>
         </w:rPr>
-        <w:t>A Sensors review that only names algorithms without naming the datasets they were scored on is hard to use. Table 8 lists the public suites that most of the papers in Sections 3.1-3.3 actually report. TUM RGB-D and ICL-NUIM made indoor RGB-D odometry comparable [100,128]. EuRoC and TUM VI did the same for visual-inertial estimators on MAVs and handheld sensors [129,130]. KITTI and later driving sets (including nuScenes) dominate outdoor completion and lidar-camera fusion [73,81,82,131]. NYU-Depth, ScanNet, and Matterport3D supply indoor labels for completion and semantics [70,79,80]. YCB and BOP supply objects and 6-DoF pose protocols for grasping cells [124,132].</w:t>
+        <w:t>A Sensors-style review that names estimators without naming the datasets they were scored on is hard to use. Table 8 lists the public suites that most of the papers in Sections 3.1-3.3 actually report. TUM RGB-D and ICL-NUIM made indoor RGB-D odometry comparable [100,128]. EuRoC and TUM VI did the same for visual-inertial estimators on MAVs and handheld sensors [129,130]. KITTI and later driving sets (including nuScenes) dominate outdoor completion and lidar-camera fusion [73,81,82,131]. NYU-Depth, ScanNet, and Matterport3D supply indoor labels for completion and semantics [70,79,80]. YCB and BOP supply objects and 6-DoF pose protocols for grasping cells [124,132].</w:t>
       </w:r>
     </w:p>
     <w:p>
@@ -5006,7 +4991,7 @@
           <w:i w:val="0"/>
           <w:sz w:val="22"/>
         </w:rPr>
-        <w:t>Two caveats matter more than the leaderboard. First, a good absolute trajectory error on TUM RGB-D or EuRoC does not certify a warehouse aisle or a sunny yard: those sequences are short, mostly well lit, and free of the safety integrity requirement [4,100,129]. Second, completion RMSE on KITTI is a score on projected LiDAR, not a guarantee that thin, transparent, or never-seen objects are recovered [73,82]. A design review should therefore treat Table 8 as a map of where a method was tested, not as a substitute for a factory or flight trial.</w:t>
+        <w:t>Leaderboard numbers travel poorly onto a shop floor. Absolute trajectory error on TUM RGB-D or EuRoC is measured on short, mostly well-lit sequences that carry no safety-integrity requirement, so a strong score does not certify a warehouse aisle or a sunlit yard [4,100,129]. Completion RMSE on KITTI is a score on projected LiDAR; it does not guarantee that thin, transparent, or never-seen objects are recovered [73,82]. Table 8 is therefore a map of where a method was tested. A factory or flight trial still has to be run on the real surfaces.</w:t>
       </w:r>
     </w:p>
     <w:p>
@@ -6100,7 +6085,7 @@
           <w:i w:val="0"/>
           <w:sz w:val="22"/>
         </w:rPr>
-        <w:t>Mapping and inspection is the second use. Photogrammetry from RGB already builds impressive models [145,146]. Depth or LiDAR is added when the operator needs metric scale, vegetation penetration, or a flight path that stays a fixed standoff from a girder [67,145,146,147,148]. Bridge work is the most documented civil case: drone-enabled visual inspection procedures exist, and unmanned systems have been used to cue fatigue-crack examination on steel members [147,148]. Quality-assessment studies warn that a pretty mesh is not an inspection: motion blur, standoff, and lighting can hide the crack the flight was commissioned to find [149]. Next-best-view planners show how a ranging front-end can choose the next pose instead of flying a fixed lawnmower [150]. Civil-infrastructure reviews show that the bottleneck is rarely whether a point cloud can be built. It is converting that cloud into defect locations that an engineer will trust [67]. Aerial manipulation is a third, still-research use: a ranging front-end can keep a tool at a commanded standoff, but contact dynamics then dominate the stack [151].</w:t>
+        <w:t>Mapping and inspection is the second use. Photogrammetry from RGB already builds impressive models [145,146]. Depth or LiDAR is added when the operator needs metric scale, vegetation penetration, or a flight path that stays a fixed standoff from a girder [67,145,146,147,148]. Bridge work is the most documented civil case: drone-enabled visual inspection procedures exist, and unmanned systems have been used to cue fatigue-crack examination on steel members [147,148]. Quality-assessment studies warn that a pretty mesh is not an inspection: motion blur, standoff, and lighting can hide the crack the flight was commissioned to find [149]. Next-best-view planners show how a ranging front-end can choose the next pose instead of flying a fixed lawnmower [150]. Civil-infrastructure reviews locate the remaining difficulty after the cloud exists: converting points into defect locations that an inspector will sign [67]. Aerial manipulation is still mostly research; a ranging front-end can hold a commanded standoff, after which contact dynamics take over the stack [151].</w:t>
       </w:r>
     </w:p>
     <w:p>
@@ -6216,7 +6201,7 @@
           <w:i w:val="0"/>
           <w:sz w:val="22"/>
         </w:rPr>
-        <w:t>Workspace monitoring. A ceiling or cell-side depth sensor builds a three-dimensional occupancy of the shared volume. Speed-and-separation monitoring, as framed by ISO/TS 15066, can then slow or stop the arm when a person enters a warning or protective zone [3,33]. The industrial-robot safety standard ISO 10218 still sits underneath that technical specification [34]. Three-dimensional monitoring is more complete than a light curtain because it can shrink the protective volume as the arm slows and can see a person who leans over a fence. Control papers that quantify collaborative safety treat separation, speed, and a defined protective stop as metrics, not as a camera specification [156]. A consumer RGB-D camera is not automatically a safety-rated device. Certified implementations still need a safety controller, defined failure modes, and usually a redundant sensing channel [3,33,153,155]. Surveys of industrial human-robot collaboration treat safety and the user interface as the two bottlenecks that decide whether a cobot is actually used, not whether a depth demo exists [3,152,154]. Collision detection on the arm itself remains necessary because vision cannot see inside the contact [153].</w:t>
+        <w:t>Workspace monitoring. A ceiling or cell-side depth sensor builds a three-dimensional occupancy of the shared volume. Speed-and-separation monitoring, as framed by ISO/TS 15066, can then slow or stop the arm when a person enters a warning or protective zone [3,33]. The industrial-robot safety standard ISO 10218 still sits underneath that technical specification [34]. Three-dimensional monitoring is more complete than a light curtain because it can shrink the protective volume as the arm slows and can see a person who leans over a fence. Control papers that quantify collaborative safety treat separation, speed, and a defined protective stop as metrics, not as a camera specification [156]. A USB RGB-D module has no safety rating of its own. Certified cells still add a safety controller, documented failure modes, and usually a second sensing channel [3,33,153,155]. Industrial HRI surveys treat safety and the user interface as the two issues that decide whether a cobot is actually used; a depth demonstration by itself does not settle that [3,152,154]. Collision detection on the arm remains necessary, because a camera cannot see inside the contact [153].</w:t>
       </w:r>
     </w:p>
     <w:p>
@@ -6232,7 +6217,7 @@
           <w:i w:val="0"/>
           <w:sz w:val="22"/>
         </w:rPr>
-        <w:t>Programming by demonstration. Tracking a tool or a marked workpiece in 3D lets a non-expert move the robot through a path [3,152]. Structured light at short range is usually sufficient. The hard parts are correspondence, occlusion by the operator, and converting a human demonstration into a collision-free, force-feasible program. Gesture and activity cues can distinguish a small set of commands or detect that a station is ready for the next part [3,16]. This is useful. It is not a substitute for a well-designed hardware enable switch.</w:t>
+        <w:t>Programming by demonstration. Tracking a tool or a marked workpiece in 3D lets a non-expert move the robot through a path [3,152]. Structured light at short range is usually sufficient. The hard parts are correspondence, occlusion by the operator, and converting a human demonstration into a collision-free, force-feasible program. Gesture and activity cues can distinguish a small set of commands or detect that a station is ready for the next part [3,16]. Those cues still sit behind a hardware enable switch; they do not replace it.</w:t>
       </w:r>
     </w:p>
     <w:p>
@@ -6451,7 +6436,7 @@
           <w:i w:val="0"/>
           <w:sz w:val="22"/>
         </w:rPr>
-        <w:t>The research literature sometimes treats remaining errors as temporary. Fielded mechatronic systems suggest otherwise. Table 7 separates mitigations that already ship from ideas that remain research.</w:t>
+        <w:t>Published algorithms sometimes describe leftover ranging error as a temporary software problem. Fielded cells suggest a slower picture. Table 7 splits mitigations that already ship from ideas that remain in the laboratory.</w:t>
       </w:r>
     </w:p>
     <w:p>
@@ -6994,7 +6979,7 @@
           <w:i w:val="0"/>
           <w:sz w:val="22"/>
         </w:rPr>
-        <w:t>Event-based and neuromorphic sensing. Asynchronous pixels report contrast changes at microsecond latency and high dynamic range [28,157,160]. Combined with pulsed illumination they can support low-power depth for high-speed robots [142,143,144,161,162]. Automotive work has already shown that event cameras can close a low-latency perception loop that frame cameras miss [163]. Co-design with spiking processors aims to cut the energy of spatial reasoning [158,159]. These systems will complement, not replace, frame-based RGB-D in the next product cycle.</w:t>
+        <w:t>Event-based and neuromorphic sensing. Asynchronous pixels report contrast changes at microsecond latency and high dynamic range [28,157,160]. Combined with pulsed illumination they can support low-power depth for high-speed robots [142,143,144,161,162]. Automotive work has already shown that event cameras can close a low-latency perception loop that frame cameras miss [163]. Co-design with spiking processors aims to cut the energy of spatial reasoning [158,159]. In the next product cycle those pipelines are more likely to sit beside frame-based RGB-D than to retire it.</w:t>
       </w:r>
     </w:p>
     <w:p>
@@ -7086,7 +7071,7 @@
           <w:i w:val="0"/>
           <w:sz w:val="22"/>
         </w:rPr>
-        <w:t>Depth vision in mechatronics did not evolve as a single replacement chain. Structured light made dense, inexpensive, close-range geometry ordinary. ToF made that geometry small enough for mobile heads and phones. Solid-state LiDAR made long-range ranging compatible with vibration-sensitive platforms. Algorithms (completion, tight-coupled odometry, RGB-D SLAM, and 3D semantics) converted those measurements into poses, maps, grasps, and safety zones.</w:t>
+        <w:t>Depth vision reached factory robots, indoor bases, and small UAVs through three overlapping hardware waves rather than through a single replacement chain. Structured light made dense, inexpensive, close-range geometry ordinary. ToF shrank that measurement onto mobile heads and phones. Solid-state LiDAR then made long-range ranging compatible with vibration-sensitive airframes. Completion, tight-coupled odometry, RGB-D SLAM, and 3D semantics converted those measurements into poses, maps, grasps, and safety zones.</w:t>
       </w:r>
     </w:p>
     <w:p>
@@ -7102,7 +7087,7 @@
           <w:i w:val="0"/>
           <w:sz w:val="22"/>
         </w:rPr>
-        <w:t>The remaining limits are mostly physical and organizational: sunlight and materials, watts and memory, calibration, and fragmented interfaces. A next-generation system is unlikely to be one perfect depth camera. It is more likely to be a small set of complementary ranges, an estimator that knows its integrity, and, where possible, a shared map that the machine does not have to rebuild on every shift.</w:t>
+        <w:t>What still limits deployment is mostly physics and organisation: sunlight and materials, watts and memory, calibration drift, and coordinate frames that differ by vendor. The next useful stack is therefore unlikely to be one universal camera. It is more likely to be a short set of complementary ranges, an estimator that reports when it should be ignored, and, where the factory allows it, a shared map that each shift does not have to rebuild.</w:t>
       </w:r>
     </w:p>
     <w:p>
@@ -7118,7 +7103,7 @@
           <w:i w:val="0"/>
           <w:sz w:val="22"/>
         </w:rPr>
-        <w:t>For practitioners, the operational conclusion is conservative. Choose the sensor by operating envelope, not by marketing generation. Budget calibration and lighting as first-class design items. Keep a metric, low-level range channel whenever the output can stop a motor. Treat public benchmarks as a map of where a method was tested, then re-test on the real surfaces, lighting, and safety integrity of the cell or airframe.</w:t>
+        <w:t>The practical close is conservative. Pick the family from the operating envelope rather than from the marketing generation. Put calibration, lighting, and a warm-up interval on the same budget line as the camera. Keep a lightly filtered metric range path whenever the output can stop a motor. Use public benchmarks to see where a method was tested, then repeat the test on the surfaces, lighting, and safety integrity of the actual cell or airframe.</w:t>
       </w:r>
     </w:p>
     <w:p>

</xml_diff>